<commit_message>
segundo cambio: se ingreso unos enlacec ect etc
</commit_message>
<xml_diff>
--- a/ACTV#1-D-S-D.docx
+++ b/ACTV#1-D-S-D.docx
@@ -2074,16 +2074,7 @@
           <w:szCs w:val="24"/>
           <w:lang w:eastAsia="es-EC"/>
         </w:rPr>
-        <w:t>Draw.io.</w:t>
-      </w:r>
-      <w:r>
-        <w:rPr>
-          <w:rFonts w:ascii="Times New Roman" w:hAnsi="Times New Roman" w:cs="Times New Roman"/>
-          <w:sz w:val="24"/>
-          <w:szCs w:val="24"/>
-          <w:lang w:eastAsia="es-EC"/>
-        </w:rPr>
-        <w:t xml:space="preserve"> </w:t>
+        <w:t xml:space="preserve">Draw.io. </w:t>
       </w:r>
     </w:p>
     <w:p>
@@ -3226,9 +3217,29 @@
     </w:p>
     <w:p>
       <w:pPr>
-        <w:pStyle w:val="Sinespaciado"/>
-        <w:spacing w:line="360" w:lineRule="auto"/>
-        <w:jc w:val="both"/>
+        <w:rPr>
+          <w:rFonts w:ascii="Times New Roman" w:hAnsi="Times New Roman" w:cs="Times New Roman"/>
+          <w:b/>
+          <w:bCs/>
+          <w:sz w:val="24"/>
+          <w:szCs w:val="24"/>
+          <w:lang w:eastAsia="es-EC"/>
+        </w:rPr>
+      </w:pPr>
+      <w:r>
+        <w:rPr>
+          <w:rFonts w:ascii="Times New Roman" w:hAnsi="Times New Roman" w:cs="Times New Roman"/>
+          <w:b/>
+          <w:bCs/>
+          <w:sz w:val="24"/>
+          <w:szCs w:val="24"/>
+          <w:lang w:eastAsia="es-EC"/>
+        </w:rPr>
+        <w:t>Enlace del repositorio</w:t>
+      </w:r>
+    </w:p>
+    <w:p>
+      <w:pPr>
         <w:rPr>
           <w:rFonts w:ascii="Times New Roman" w:hAnsi="Times New Roman" w:cs="Times New Roman"/>
           <w:b/>
@@ -3239,6 +3250,94 @@
         </w:rPr>
       </w:pPr>
       <w:hyperlink r:id="rId17" w:history="1">
+        <w:r>
+          <w:rPr>
+            <w:rStyle w:val="Hipervnculo"/>
+            <w:rFonts w:ascii="Times New Roman" w:hAnsi="Times New Roman" w:cs="Times New Roman"/>
+            <w:b/>
+            <w:bCs/>
+            <w:sz w:val="24"/>
+            <w:szCs w:val="24"/>
+            <w:lang w:eastAsia="es-EC"/>
+          </w:rPr>
+          <w:t>https://github.com/mmurillo2997-a11y/5semestre-dD.S.I</w:t>
+        </w:r>
+        <w:r>
+          <w:rPr>
+            <w:rStyle w:val="Hipervnculo"/>
+            <w:rFonts w:ascii="Times New Roman" w:hAnsi="Times New Roman" w:cs="Times New Roman"/>
+            <w:b/>
+            <w:bCs/>
+            <w:sz w:val="24"/>
+            <w:szCs w:val="24"/>
+            <w:lang w:eastAsia="es-EC"/>
+          </w:rPr>
+          <w:t>.git</w:t>
+        </w:r>
+      </w:hyperlink>
+    </w:p>
+    <w:p>
+      <w:pPr>
+        <w:rPr>
+          <w:rFonts w:ascii="Times New Roman" w:hAnsi="Times New Roman" w:cs="Times New Roman"/>
+          <w:b/>
+          <w:bCs/>
+          <w:sz w:val="24"/>
+          <w:szCs w:val="24"/>
+          <w:lang w:eastAsia="es-EC"/>
+        </w:rPr>
+      </w:pPr>
+    </w:p>
+    <w:p>
+      <w:pPr>
+        <w:rPr>
+          <w:rFonts w:ascii="Times New Roman" w:hAnsi="Times New Roman" w:cs="Times New Roman"/>
+          <w:b/>
+          <w:bCs/>
+          <w:sz w:val="24"/>
+          <w:szCs w:val="24"/>
+          <w:lang w:eastAsia="es-EC"/>
+        </w:rPr>
+      </w:pPr>
+    </w:p>
+    <w:p>
+      <w:pPr>
+        <w:rPr>
+          <w:rFonts w:ascii="Times New Roman" w:hAnsi="Times New Roman" w:cs="Times New Roman"/>
+          <w:b/>
+          <w:bCs/>
+          <w:sz w:val="24"/>
+          <w:szCs w:val="24"/>
+          <w:lang w:eastAsia="es-EC"/>
+        </w:rPr>
+      </w:pPr>
+      <w:r>
+        <w:rPr>
+          <w:rFonts w:ascii="Times New Roman" w:hAnsi="Times New Roman" w:cs="Times New Roman"/>
+          <w:b/>
+          <w:bCs/>
+          <w:sz w:val="24"/>
+          <w:szCs w:val="24"/>
+          <w:lang w:eastAsia="es-EC"/>
+        </w:rPr>
+        <w:t xml:space="preserve">Enlaces de diagramas </w:t>
+      </w:r>
+    </w:p>
+    <w:p>
+      <w:pPr>
+        <w:pStyle w:val="Sinespaciado"/>
+        <w:spacing w:line="360" w:lineRule="auto"/>
+        <w:jc w:val="both"/>
+        <w:rPr>
+          <w:rFonts w:ascii="Times New Roman" w:hAnsi="Times New Roman" w:cs="Times New Roman"/>
+          <w:b/>
+          <w:bCs/>
+          <w:sz w:val="24"/>
+          <w:szCs w:val="24"/>
+          <w:lang w:eastAsia="es-EC"/>
+        </w:rPr>
+      </w:pPr>
+      <w:hyperlink r:id="rId18" w:history="1">
         <w:r>
           <w:rPr>
             <w:rStyle w:val="Hipervnculo"/>
@@ -3282,7 +3381,7 @@
           <w:lang w:eastAsia="es-EC"/>
         </w:rPr>
       </w:pPr>
-      <w:hyperlink r:id="rId18" w:history="1">
+      <w:hyperlink r:id="rId19" w:history="1">
         <w:r>
           <w:rPr>
             <w:rStyle w:val="Hipervnculo"/>
@@ -3326,7 +3425,7 @@
           <w:lang w:eastAsia="es-EC"/>
         </w:rPr>
       </w:pPr>
-      <w:hyperlink r:id="rId19" w:history="1">
+      <w:hyperlink r:id="rId20" w:history="1">
         <w:r>
           <w:rPr>
             <w:rStyle w:val="Hipervnculo"/>
@@ -3400,8 +3499,414 @@
         <w:jc w:val="both"/>
         <w:rPr>
           <w:rFonts w:ascii="Times New Roman" w:hAnsi="Times New Roman" w:cs="Times New Roman"/>
-          <w:i/>
-          <w:iCs/>
+          <w:b/>
+          <w:bCs/>
+          <w:sz w:val="24"/>
+          <w:szCs w:val="24"/>
+          <w:lang w:eastAsia="es-EC"/>
+        </w:rPr>
+      </w:pPr>
+      <w:r>
+        <w:rPr>
+          <w:rFonts w:ascii="Times New Roman" w:hAnsi="Times New Roman" w:cs="Times New Roman"/>
+          <w:b/>
+          <w:bCs/>
+          <w:sz w:val="24"/>
+          <w:szCs w:val="24"/>
+          <w:lang w:eastAsia="es-EC"/>
+        </w:rPr>
+        <w:t>A</w:t>
+      </w:r>
+      <w:r>
+        <w:rPr>
+          <w:rFonts w:ascii="Times New Roman" w:hAnsi="Times New Roman" w:cs="Times New Roman"/>
+          <w:b/>
+          <w:bCs/>
+          <w:sz w:val="24"/>
+          <w:szCs w:val="24"/>
+          <w:lang w:eastAsia="es-EC"/>
+        </w:rPr>
+        <w:t>nexo</w:t>
+      </w:r>
+      <w:r>
+        <w:rPr>
+          <w:rFonts w:ascii="Times New Roman" w:hAnsi="Times New Roman" w:cs="Times New Roman"/>
+          <w:b/>
+          <w:bCs/>
+          <w:sz w:val="24"/>
+          <w:szCs w:val="24"/>
+          <w:lang w:eastAsia="es-EC"/>
+        </w:rPr>
+        <w:t>s</w:t>
+      </w:r>
+    </w:p>
+    <w:p>
+      <w:pPr>
+        <w:widowControl w:val="0"/>
+        <w:pBdr>
+          <w:top w:val="nil"/>
+          <w:left w:val="nil"/>
+          <w:bottom w:val="nil"/>
+          <w:right w:val="nil"/>
+          <w:between w:val="nil"/>
+        </w:pBdr>
+        <w:spacing w:after="0" w:line="240" w:lineRule="auto"/>
+        <w:jc w:val="both"/>
+        <w:rPr>
+          <w:rFonts w:ascii="Times New Roman" w:hAnsi="Times New Roman" w:cs="Times New Roman"/>
+          <w:b/>
+          <w:bCs/>
+          <w:sz w:val="24"/>
+          <w:szCs w:val="24"/>
+          <w:lang w:eastAsia="es-EC"/>
+        </w:rPr>
+      </w:pPr>
+    </w:p>
+    <w:p>
+      <w:pPr>
+        <w:widowControl w:val="0"/>
+        <w:pBdr>
+          <w:top w:val="nil"/>
+          <w:left w:val="nil"/>
+          <w:bottom w:val="nil"/>
+          <w:right w:val="nil"/>
+          <w:between w:val="nil"/>
+        </w:pBdr>
+        <w:spacing w:after="0" w:line="240" w:lineRule="auto"/>
+        <w:jc w:val="both"/>
+        <w:rPr>
+          <w:rFonts w:ascii="Times New Roman" w:hAnsi="Times New Roman" w:cs="Times New Roman"/>
+          <w:b/>
+          <w:bCs/>
+          <w:sz w:val="24"/>
+          <w:szCs w:val="24"/>
+          <w:lang w:eastAsia="es-EC"/>
+        </w:rPr>
+      </w:pPr>
+      <w:r>
+        <w:rPr>
+          <w:rFonts w:ascii="Times New Roman" w:hAnsi="Times New Roman" w:cs="Times New Roman"/>
+          <w:b/>
+          <w:bCs/>
+          <w:sz w:val="24"/>
+          <w:szCs w:val="24"/>
+          <w:lang w:eastAsia="es-EC"/>
+        </w:rPr>
+        <w:drawing>
+          <wp:inline distT="0" distB="0" distL="0" distR="0" wp14:anchorId="3204E6D7" wp14:editId="24592A1F">
+            <wp:extent cx="5400040" cy="3037840"/>
+            <wp:effectExtent l="0" t="0" r="0" b="0"/>
+            <wp:docPr id="1908668491" name="Imagen 2"/>
+            <wp:cNvGraphicFramePr>
+              <a:graphicFrameLocks xmlns:a="http://schemas.openxmlformats.org/drawingml/2006/main" noChangeAspect="1"/>
+            </wp:cNvGraphicFramePr>
+            <a:graphic xmlns:a="http://schemas.openxmlformats.org/drawingml/2006/main">
+              <a:graphicData uri="http://schemas.openxmlformats.org/drawingml/2006/picture">
+                <pic:pic xmlns:pic="http://schemas.openxmlformats.org/drawingml/2006/picture">
+                  <pic:nvPicPr>
+                    <pic:cNvPr id="0" name="Picture 2"/>
+                    <pic:cNvPicPr>
+                      <a:picLocks noChangeAspect="1" noChangeArrowheads="1"/>
+                    </pic:cNvPicPr>
+                  </pic:nvPicPr>
+                  <pic:blipFill>
+                    <a:blip r:embed="rId21">
+                      <a:extLst>
+                        <a:ext uri="{28A0092B-C50C-407E-A947-70E740481C1C}">
+                          <a14:useLocalDpi xmlns:a14="http://schemas.microsoft.com/office/drawing/2010/main" val="0"/>
+                        </a:ext>
+                      </a:extLst>
+                    </a:blip>
+                    <a:srcRect/>
+                    <a:stretch>
+                      <a:fillRect/>
+                    </a:stretch>
+                  </pic:blipFill>
+                  <pic:spPr bwMode="auto">
+                    <a:xfrm>
+                      <a:off x="0" y="0"/>
+                      <a:ext cx="5400040" cy="3037840"/>
+                    </a:xfrm>
+                    <a:prstGeom prst="rect">
+                      <a:avLst/>
+                    </a:prstGeom>
+                    <a:noFill/>
+                    <a:ln>
+                      <a:noFill/>
+                    </a:ln>
+                  </pic:spPr>
+                </pic:pic>
+              </a:graphicData>
+            </a:graphic>
+          </wp:inline>
+        </w:drawing>
+      </w:r>
+    </w:p>
+    <w:p>
+      <w:pPr>
+        <w:widowControl w:val="0"/>
+        <w:pBdr>
+          <w:top w:val="nil"/>
+          <w:left w:val="nil"/>
+          <w:bottom w:val="nil"/>
+          <w:right w:val="nil"/>
+          <w:between w:val="nil"/>
+        </w:pBdr>
+        <w:spacing w:after="0" w:line="240" w:lineRule="auto"/>
+        <w:jc w:val="both"/>
+        <w:rPr>
+          <w:rFonts w:ascii="Times New Roman" w:hAnsi="Times New Roman" w:cs="Times New Roman"/>
+          <w:b/>
+          <w:bCs/>
+          <w:sz w:val="24"/>
+          <w:szCs w:val="24"/>
+          <w:lang w:eastAsia="es-EC"/>
+        </w:rPr>
+      </w:pPr>
+    </w:p>
+    <w:p>
+      <w:pPr>
+        <w:widowControl w:val="0"/>
+        <w:pBdr>
+          <w:top w:val="nil"/>
+          <w:left w:val="nil"/>
+          <w:bottom w:val="nil"/>
+          <w:right w:val="nil"/>
+          <w:between w:val="nil"/>
+        </w:pBdr>
+        <w:spacing w:after="0" w:line="240" w:lineRule="auto"/>
+        <w:jc w:val="both"/>
+        <w:rPr>
+          <w:rFonts w:ascii="Times New Roman" w:hAnsi="Times New Roman" w:cs="Times New Roman"/>
+          <w:b/>
+          <w:bCs/>
+          <w:sz w:val="24"/>
+          <w:szCs w:val="24"/>
+          <w:lang w:eastAsia="es-EC"/>
+        </w:rPr>
+      </w:pPr>
+    </w:p>
+    <w:p>
+      <w:pPr>
+        <w:widowControl w:val="0"/>
+        <w:pBdr>
+          <w:top w:val="nil"/>
+          <w:left w:val="nil"/>
+          <w:bottom w:val="nil"/>
+          <w:right w:val="nil"/>
+          <w:between w:val="nil"/>
+        </w:pBdr>
+        <w:spacing w:after="0" w:line="240" w:lineRule="auto"/>
+        <w:jc w:val="both"/>
+        <w:rPr>
+          <w:rFonts w:ascii="Times New Roman" w:hAnsi="Times New Roman" w:cs="Times New Roman"/>
+          <w:b/>
+          <w:bCs/>
+          <w:sz w:val="24"/>
+          <w:szCs w:val="24"/>
+          <w:lang w:eastAsia="es-EC"/>
+        </w:rPr>
+      </w:pPr>
+      <w:r>
+        <w:rPr>
+          <w:rFonts w:ascii="Times New Roman" w:hAnsi="Times New Roman" w:cs="Times New Roman"/>
+          <w:b/>
+          <w:bCs/>
+          <w:sz w:val="24"/>
+          <w:szCs w:val="24"/>
+          <w:lang w:eastAsia="es-EC"/>
+        </w:rPr>
+        <w:lastRenderedPageBreak/>
+        <w:drawing>
+          <wp:inline distT="0" distB="0" distL="0" distR="0" wp14:anchorId="251C0C88" wp14:editId="5530B539">
+            <wp:extent cx="5400040" cy="3037840"/>
+            <wp:effectExtent l="0" t="0" r="0" b="0"/>
+            <wp:docPr id="1454501102" name="Imagen 3"/>
+            <wp:cNvGraphicFramePr>
+              <a:graphicFrameLocks xmlns:a="http://schemas.openxmlformats.org/drawingml/2006/main" noChangeAspect="1"/>
+            </wp:cNvGraphicFramePr>
+            <a:graphic xmlns:a="http://schemas.openxmlformats.org/drawingml/2006/main">
+              <a:graphicData uri="http://schemas.openxmlformats.org/drawingml/2006/picture">
+                <pic:pic xmlns:pic="http://schemas.openxmlformats.org/drawingml/2006/picture">
+                  <pic:nvPicPr>
+                    <pic:cNvPr id="0" name="Picture 4"/>
+                    <pic:cNvPicPr>
+                      <a:picLocks noChangeAspect="1" noChangeArrowheads="1"/>
+                    </pic:cNvPicPr>
+                  </pic:nvPicPr>
+                  <pic:blipFill>
+                    <a:blip r:embed="rId22">
+                      <a:extLst>
+                        <a:ext uri="{28A0092B-C50C-407E-A947-70E740481C1C}">
+                          <a14:useLocalDpi xmlns:a14="http://schemas.microsoft.com/office/drawing/2010/main" val="0"/>
+                        </a:ext>
+                      </a:extLst>
+                    </a:blip>
+                    <a:srcRect/>
+                    <a:stretch>
+                      <a:fillRect/>
+                    </a:stretch>
+                  </pic:blipFill>
+                  <pic:spPr bwMode="auto">
+                    <a:xfrm>
+                      <a:off x="0" y="0"/>
+                      <a:ext cx="5400040" cy="3037840"/>
+                    </a:xfrm>
+                    <a:prstGeom prst="rect">
+                      <a:avLst/>
+                    </a:prstGeom>
+                    <a:noFill/>
+                    <a:ln>
+                      <a:noFill/>
+                    </a:ln>
+                  </pic:spPr>
+                </pic:pic>
+              </a:graphicData>
+            </a:graphic>
+          </wp:inline>
+        </w:drawing>
+      </w:r>
+    </w:p>
+    <w:p>
+      <w:pPr>
+        <w:widowControl w:val="0"/>
+        <w:pBdr>
+          <w:top w:val="nil"/>
+          <w:left w:val="nil"/>
+          <w:bottom w:val="nil"/>
+          <w:right w:val="nil"/>
+          <w:between w:val="nil"/>
+        </w:pBdr>
+        <w:spacing w:after="0" w:line="240" w:lineRule="auto"/>
+        <w:jc w:val="both"/>
+        <w:rPr>
+          <w:rFonts w:ascii="Times New Roman" w:hAnsi="Times New Roman" w:cs="Times New Roman"/>
+          <w:b/>
+          <w:bCs/>
+          <w:sz w:val="24"/>
+          <w:szCs w:val="24"/>
+          <w:lang w:eastAsia="es-EC"/>
+        </w:rPr>
+      </w:pPr>
+    </w:p>
+    <w:p>
+      <w:pPr>
+        <w:widowControl w:val="0"/>
+        <w:pBdr>
+          <w:top w:val="nil"/>
+          <w:left w:val="nil"/>
+          <w:bottom w:val="nil"/>
+          <w:right w:val="nil"/>
+          <w:between w:val="nil"/>
+        </w:pBdr>
+        <w:spacing w:after="0" w:line="240" w:lineRule="auto"/>
+        <w:jc w:val="both"/>
+        <w:rPr>
+          <w:rFonts w:ascii="Times New Roman" w:hAnsi="Times New Roman" w:cs="Times New Roman"/>
+          <w:b/>
+          <w:bCs/>
+          <w:sz w:val="24"/>
+          <w:szCs w:val="24"/>
+          <w:lang w:eastAsia="es-EC"/>
+        </w:rPr>
+      </w:pPr>
+    </w:p>
+    <w:p>
+      <w:pPr>
+        <w:widowControl w:val="0"/>
+        <w:pBdr>
+          <w:top w:val="nil"/>
+          <w:left w:val="nil"/>
+          <w:bottom w:val="nil"/>
+          <w:right w:val="nil"/>
+          <w:between w:val="nil"/>
+        </w:pBdr>
+        <w:spacing w:after="0" w:line="240" w:lineRule="auto"/>
+        <w:jc w:val="both"/>
+        <w:rPr>
+          <w:rFonts w:ascii="Times New Roman" w:hAnsi="Times New Roman" w:cs="Times New Roman"/>
+          <w:b/>
+          <w:bCs/>
+          <w:sz w:val="24"/>
+          <w:szCs w:val="24"/>
+          <w:lang w:eastAsia="es-EC"/>
+        </w:rPr>
+      </w:pPr>
+      <w:r>
+        <w:rPr>
+          <w:rFonts w:ascii="Times New Roman" w:hAnsi="Times New Roman" w:cs="Times New Roman"/>
+          <w:b/>
+          <w:bCs/>
+          <w:sz w:val="24"/>
+          <w:szCs w:val="24"/>
+          <w:lang w:eastAsia="es-EC"/>
+        </w:rPr>
+        <w:drawing>
+          <wp:inline distT="0" distB="0" distL="0" distR="0" wp14:anchorId="72583445" wp14:editId="079C16C1">
+            <wp:extent cx="5400040" cy="3037840"/>
+            <wp:effectExtent l="0" t="0" r="0" b="0"/>
+            <wp:docPr id="1898362679" name="Imagen 4"/>
+            <wp:cNvGraphicFramePr>
+              <a:graphicFrameLocks xmlns:a="http://schemas.openxmlformats.org/drawingml/2006/main" noChangeAspect="1"/>
+            </wp:cNvGraphicFramePr>
+            <a:graphic xmlns:a="http://schemas.openxmlformats.org/drawingml/2006/main">
+              <a:graphicData uri="http://schemas.openxmlformats.org/drawingml/2006/picture">
+                <pic:pic xmlns:pic="http://schemas.openxmlformats.org/drawingml/2006/picture">
+                  <pic:nvPicPr>
+                    <pic:cNvPr id="0" name="Picture 6"/>
+                    <pic:cNvPicPr>
+                      <a:picLocks noChangeAspect="1" noChangeArrowheads="1"/>
+                    </pic:cNvPicPr>
+                  </pic:nvPicPr>
+                  <pic:blipFill>
+                    <a:blip r:embed="rId23">
+                      <a:extLst>
+                        <a:ext uri="{28A0092B-C50C-407E-A947-70E740481C1C}">
+                          <a14:useLocalDpi xmlns:a14="http://schemas.microsoft.com/office/drawing/2010/main" val="0"/>
+                        </a:ext>
+                      </a:extLst>
+                    </a:blip>
+                    <a:srcRect/>
+                    <a:stretch>
+                      <a:fillRect/>
+                    </a:stretch>
+                  </pic:blipFill>
+                  <pic:spPr bwMode="auto">
+                    <a:xfrm>
+                      <a:off x="0" y="0"/>
+                      <a:ext cx="5400040" cy="3037840"/>
+                    </a:xfrm>
+                    <a:prstGeom prst="rect">
+                      <a:avLst/>
+                    </a:prstGeom>
+                    <a:noFill/>
+                    <a:ln>
+                      <a:noFill/>
+                    </a:ln>
+                  </pic:spPr>
+                </pic:pic>
+              </a:graphicData>
+            </a:graphic>
+          </wp:inline>
+        </w:drawing>
+      </w:r>
+    </w:p>
+    <w:p>
+      <w:pPr>
+        <w:widowControl w:val="0"/>
+        <w:pBdr>
+          <w:top w:val="nil"/>
+          <w:left w:val="nil"/>
+          <w:bottom w:val="nil"/>
+          <w:right w:val="nil"/>
+          <w:between w:val="nil"/>
+        </w:pBdr>
+        <w:spacing w:after="0" w:line="240" w:lineRule="auto"/>
+        <w:jc w:val="both"/>
+        <w:rPr>
+          <w:rFonts w:ascii="Times New Roman" w:hAnsi="Times New Roman" w:cs="Times New Roman"/>
+          <w:b/>
+          <w:bCs/>
           <w:sz w:val="24"/>
           <w:szCs w:val="24"/>
           <w:lang w:eastAsia="es-EC"/>
@@ -3409,7 +3914,7 @@
       </w:pPr>
     </w:p>
     <w:sectPr>
-      <w:headerReference w:type="first" r:id="rId20"/>
+      <w:headerReference w:type="first" r:id="rId24"/>
       <w:pgSz w:w="11906" w:h="16838"/>
       <w:pgMar w:top="1417" w:right="1701" w:bottom="1417" w:left="1701" w:header="708" w:footer="708" w:gutter="0"/>
       <w:pgNumType w:start="1"/>
@@ -8110,6 +8615,18 @@
       <w:shd w:val="clear" w:color="auto" w:fill="E1DFDD"/>
     </w:rPr>
   </w:style>
+  <w:style w:type="character" w:styleId="Hipervnculovisitado">
+    <w:name w:val="FollowedHyperlink"/>
+    <w:basedOn w:val="Fuentedeprrafopredeter"/>
+    <w:uiPriority w:val="99"/>
+    <w:semiHidden/>
+    <w:unhideWhenUsed/>
+    <w:rsid w:val="00891BE1"/>
+    <w:rPr>
+      <w:color w:val="954F72" w:themeColor="followedHyperlink"/>
+      <w:u w:val="single"/>
+    </w:rPr>
+  </w:style>
 </w:styles>
 </file>
 

</xml_diff>